<commit_message>
Pembuatan responsi Praktikum Strutur Data
</commit_message>
<xml_diff>
--- a/Praktikum/Responsi_DHANDY PUTRA FAHRUDDIN_H1D025097_SHIFT B_SHIFT D/DHANDY PUTRA FAHRUDDIN_H1D025097_SHIFT B_SHIFT D.docx
+++ b/Praktikum/Responsi_DHANDY PUTRA FAHRUDDIN_H1D025097_SHIFT B_SHIFT D/DHANDY PUTRA FAHRUDDIN_H1D025097_SHIFT B_SHIFT D.docx
@@ -381,6 +381,7 @@
           <w:noProof/>
           <w:sz w:val="28"/>
           <w:szCs w:val="28"/>
+          <w:lang w:val="sv-SE"/>
         </w:rPr>
       </w:pPr>
     </w:p>
@@ -396,6 +397,415 @@
           <w:lang w:val="sv-SE"/>
         </w:rPr>
       </w:pPr>
+      <w:r>
+        <w:rPr>
+          <w:rFonts w:ascii="Times New Roman" w:hAnsi="Times New Roman" w:cs="Times New Roman"/>
+          <w:noProof/>
+          <w:sz w:val="28"/>
+          <w:szCs w:val="28"/>
+          <w:lang w:val="sv-SE"/>
+        </w:rPr>
+        <w:drawing>
+          <wp:inline distT="0" distB="0" distL="0" distR="0" wp14:anchorId="489F711E" wp14:editId="410170DC">
+            <wp:extent cx="5036820" cy="3665220"/>
+            <wp:effectExtent l="0" t="0" r="0" b="0"/>
+            <wp:docPr id="1282257028" name="Picture 1"/>
+            <wp:cNvGraphicFramePr>
+              <a:graphicFrameLocks xmlns:a="http://schemas.openxmlformats.org/drawingml/2006/main" noChangeAspect="1"/>
+            </wp:cNvGraphicFramePr>
+            <a:graphic xmlns:a="http://schemas.openxmlformats.org/drawingml/2006/main">
+              <a:graphicData uri="http://schemas.openxmlformats.org/drawingml/2006/picture">
+                <pic:pic xmlns:pic="http://schemas.openxmlformats.org/drawingml/2006/picture">
+                  <pic:nvPicPr>
+                    <pic:cNvPr id="0" name="Picture 1"/>
+                    <pic:cNvPicPr>
+                      <a:picLocks noChangeAspect="1" noChangeArrowheads="1"/>
+                    </pic:cNvPicPr>
+                  </pic:nvPicPr>
+                  <pic:blipFill>
+                    <a:blip r:embed="rId6">
+                      <a:extLst>
+                        <a:ext uri="{28A0092B-C50C-407E-A947-70E740481C1C}">
+                          <a14:useLocalDpi xmlns:a14="http://schemas.microsoft.com/office/drawing/2010/main" val="0"/>
+                        </a:ext>
+                      </a:extLst>
+                    </a:blip>
+                    <a:srcRect/>
+                    <a:stretch>
+                      <a:fillRect/>
+                    </a:stretch>
+                  </pic:blipFill>
+                  <pic:spPr bwMode="auto">
+                    <a:xfrm>
+                      <a:off x="0" y="0"/>
+                      <a:ext cx="5036820" cy="3665220"/>
+                    </a:xfrm>
+                    <a:prstGeom prst="rect">
+                      <a:avLst/>
+                    </a:prstGeom>
+                    <a:noFill/>
+                    <a:ln>
+                      <a:noFill/>
+                    </a:ln>
+                  </pic:spPr>
+                </pic:pic>
+              </a:graphicData>
+            </a:graphic>
+          </wp:inline>
+        </w:drawing>
+      </w:r>
+    </w:p>
+    <w:p>
+      <w:pPr>
+        <w:spacing w:after="80" w:line="360" w:lineRule="auto"/>
+        <w:jc w:val="both"/>
+        <w:rPr>
+          <w:rFonts w:ascii="Times New Roman" w:hAnsi="Times New Roman" w:cs="Times New Roman"/>
+          <w:noProof/>
+          <w:sz w:val="28"/>
+          <w:szCs w:val="28"/>
+          <w:lang w:val="sv-SE"/>
+        </w:rPr>
+      </w:pPr>
+      <w:r>
+        <w:rPr>
+          <w:rFonts w:ascii="Times New Roman" w:hAnsi="Times New Roman" w:cs="Times New Roman"/>
+          <w:noProof/>
+          <w:sz w:val="28"/>
+          <w:szCs w:val="28"/>
+          <w:lang w:val="sv-SE"/>
+        </w:rPr>
+        <w:drawing>
+          <wp:inline distT="0" distB="0" distL="0" distR="0" wp14:anchorId="0E4D2012" wp14:editId="5AAC2ABE">
+            <wp:extent cx="5029200" cy="2583180"/>
+            <wp:effectExtent l="0" t="0" r="0" b="7620"/>
+            <wp:docPr id="1845346669" name="Picture 4"/>
+            <wp:cNvGraphicFramePr>
+              <a:graphicFrameLocks xmlns:a="http://schemas.openxmlformats.org/drawingml/2006/main" noChangeAspect="1"/>
+            </wp:cNvGraphicFramePr>
+            <a:graphic xmlns:a="http://schemas.openxmlformats.org/drawingml/2006/main">
+              <a:graphicData uri="http://schemas.openxmlformats.org/drawingml/2006/picture">
+                <pic:pic xmlns:pic="http://schemas.openxmlformats.org/drawingml/2006/picture">
+                  <pic:nvPicPr>
+                    <pic:cNvPr id="0" name="Picture 4"/>
+                    <pic:cNvPicPr>
+                      <a:picLocks noChangeAspect="1" noChangeArrowheads="1"/>
+                    </pic:cNvPicPr>
+                  </pic:nvPicPr>
+                  <pic:blipFill>
+                    <a:blip r:embed="rId7" cstate="print">
+                      <a:extLst>
+                        <a:ext uri="{28A0092B-C50C-407E-A947-70E740481C1C}">
+                          <a14:useLocalDpi xmlns:a14="http://schemas.microsoft.com/office/drawing/2010/main" val="0"/>
+                        </a:ext>
+                      </a:extLst>
+                    </a:blip>
+                    <a:srcRect/>
+                    <a:stretch>
+                      <a:fillRect/>
+                    </a:stretch>
+                  </pic:blipFill>
+                  <pic:spPr bwMode="auto">
+                    <a:xfrm>
+                      <a:off x="0" y="0"/>
+                      <a:ext cx="5029200" cy="2583180"/>
+                    </a:xfrm>
+                    <a:prstGeom prst="rect">
+                      <a:avLst/>
+                    </a:prstGeom>
+                    <a:noFill/>
+                    <a:ln>
+                      <a:noFill/>
+                    </a:ln>
+                  </pic:spPr>
+                </pic:pic>
+              </a:graphicData>
+            </a:graphic>
+          </wp:inline>
+        </w:drawing>
+      </w:r>
+    </w:p>
+    <w:p>
+      <w:pPr>
+        <w:spacing w:after="80" w:line="360" w:lineRule="auto"/>
+        <w:jc w:val="both"/>
+        <w:rPr>
+          <w:rFonts w:ascii="Times New Roman" w:hAnsi="Times New Roman" w:cs="Times New Roman"/>
+          <w:noProof/>
+          <w:sz w:val="28"/>
+          <w:szCs w:val="28"/>
+          <w:lang w:val="sv-SE"/>
+        </w:rPr>
+      </w:pPr>
+      <w:r>
+        <w:rPr>
+          <w:rFonts w:ascii="Times New Roman" w:hAnsi="Times New Roman" w:cs="Times New Roman"/>
+          <w:noProof/>
+          <w:sz w:val="28"/>
+          <w:szCs w:val="28"/>
+          <w:lang w:val="sv-SE"/>
+        </w:rPr>
+        <w:lastRenderedPageBreak/>
+        <w:drawing>
+          <wp:inline distT="0" distB="0" distL="0" distR="0" wp14:anchorId="43ED4D84" wp14:editId="4038B608">
+            <wp:extent cx="5029200" cy="2606040"/>
+            <wp:effectExtent l="0" t="0" r="0" b="3810"/>
+            <wp:docPr id="473802983" name="Picture 2"/>
+            <wp:cNvGraphicFramePr>
+              <a:graphicFrameLocks xmlns:a="http://schemas.openxmlformats.org/drawingml/2006/main" noChangeAspect="1"/>
+            </wp:cNvGraphicFramePr>
+            <a:graphic xmlns:a="http://schemas.openxmlformats.org/drawingml/2006/main">
+              <a:graphicData uri="http://schemas.openxmlformats.org/drawingml/2006/picture">
+                <pic:pic xmlns:pic="http://schemas.openxmlformats.org/drawingml/2006/picture">
+                  <pic:nvPicPr>
+                    <pic:cNvPr id="0" name="Picture 2"/>
+                    <pic:cNvPicPr>
+                      <a:picLocks noChangeAspect="1" noChangeArrowheads="1"/>
+                    </pic:cNvPicPr>
+                  </pic:nvPicPr>
+                  <pic:blipFill>
+                    <a:blip r:embed="rId8" cstate="print">
+                      <a:extLst>
+                        <a:ext uri="{28A0092B-C50C-407E-A947-70E740481C1C}">
+                          <a14:useLocalDpi xmlns:a14="http://schemas.microsoft.com/office/drawing/2010/main" val="0"/>
+                        </a:ext>
+                      </a:extLst>
+                    </a:blip>
+                    <a:srcRect/>
+                    <a:stretch>
+                      <a:fillRect/>
+                    </a:stretch>
+                  </pic:blipFill>
+                  <pic:spPr bwMode="auto">
+                    <a:xfrm>
+                      <a:off x="0" y="0"/>
+                      <a:ext cx="5029200" cy="2606040"/>
+                    </a:xfrm>
+                    <a:prstGeom prst="rect">
+                      <a:avLst/>
+                    </a:prstGeom>
+                    <a:noFill/>
+                    <a:ln>
+                      <a:noFill/>
+                    </a:ln>
+                  </pic:spPr>
+                </pic:pic>
+              </a:graphicData>
+            </a:graphic>
+          </wp:inline>
+        </w:drawing>
+      </w:r>
+    </w:p>
+    <w:p>
+      <w:pPr>
+        <w:spacing w:after="80" w:line="360" w:lineRule="auto"/>
+        <w:jc w:val="both"/>
+        <w:rPr>
+          <w:rFonts w:ascii="Times New Roman" w:hAnsi="Times New Roman" w:cs="Times New Roman"/>
+          <w:noProof/>
+          <w:sz w:val="28"/>
+          <w:szCs w:val="28"/>
+          <w:lang w:val="sv-SE"/>
+        </w:rPr>
+      </w:pPr>
+      <w:r>
+        <w:rPr>
+          <w:rFonts w:ascii="Times New Roman" w:hAnsi="Times New Roman" w:cs="Times New Roman"/>
+          <w:noProof/>
+          <w:sz w:val="28"/>
+          <w:szCs w:val="28"/>
+          <w:lang w:val="sv-SE"/>
+        </w:rPr>
+        <w:drawing>
+          <wp:inline distT="0" distB="0" distL="0" distR="0" wp14:anchorId="7633FBB4" wp14:editId="11C515E5">
+            <wp:extent cx="5029200" cy="4411980"/>
+            <wp:effectExtent l="0" t="0" r="0" b="7620"/>
+            <wp:docPr id="792613450" name="Picture 3"/>
+            <wp:cNvGraphicFramePr>
+              <a:graphicFrameLocks xmlns:a="http://schemas.openxmlformats.org/drawingml/2006/main" noChangeAspect="1"/>
+            </wp:cNvGraphicFramePr>
+            <a:graphic xmlns:a="http://schemas.openxmlformats.org/drawingml/2006/main">
+              <a:graphicData uri="http://schemas.openxmlformats.org/drawingml/2006/picture">
+                <pic:pic xmlns:pic="http://schemas.openxmlformats.org/drawingml/2006/picture">
+                  <pic:nvPicPr>
+                    <pic:cNvPr id="0" name="Picture 3"/>
+                    <pic:cNvPicPr>
+                      <a:picLocks noChangeAspect="1" noChangeArrowheads="1"/>
+                    </pic:cNvPicPr>
+                  </pic:nvPicPr>
+                  <pic:blipFill>
+                    <a:blip r:embed="rId9">
+                      <a:extLst>
+                        <a:ext uri="{28A0092B-C50C-407E-A947-70E740481C1C}">
+                          <a14:useLocalDpi xmlns:a14="http://schemas.microsoft.com/office/drawing/2010/main" val="0"/>
+                        </a:ext>
+                      </a:extLst>
+                    </a:blip>
+                    <a:srcRect/>
+                    <a:stretch>
+                      <a:fillRect/>
+                    </a:stretch>
+                  </pic:blipFill>
+                  <pic:spPr bwMode="auto">
+                    <a:xfrm>
+                      <a:off x="0" y="0"/>
+                      <a:ext cx="5029200" cy="4411980"/>
+                    </a:xfrm>
+                    <a:prstGeom prst="rect">
+                      <a:avLst/>
+                    </a:prstGeom>
+                    <a:noFill/>
+                    <a:ln>
+                      <a:noFill/>
+                    </a:ln>
+                  </pic:spPr>
+                </pic:pic>
+              </a:graphicData>
+            </a:graphic>
+          </wp:inline>
+        </w:drawing>
+      </w:r>
+    </w:p>
+    <w:p>
+      <w:pPr>
+        <w:spacing w:after="80" w:line="360" w:lineRule="auto"/>
+        <w:jc w:val="both"/>
+        <w:rPr>
+          <w:rFonts w:ascii="Times New Roman" w:hAnsi="Times New Roman" w:cs="Times New Roman"/>
+          <w:noProof/>
+          <w:sz w:val="28"/>
+          <w:szCs w:val="28"/>
+          <w:lang w:val="sv-SE"/>
+        </w:rPr>
+      </w:pPr>
+      <w:r>
+        <w:rPr>
+          <w:rFonts w:ascii="Times New Roman" w:hAnsi="Times New Roman" w:cs="Times New Roman"/>
+          <w:noProof/>
+          <w:sz w:val="28"/>
+          <w:szCs w:val="28"/>
+          <w:lang w:val="sv-SE"/>
+        </w:rPr>
+        <w:lastRenderedPageBreak/>
+        <w:drawing>
+          <wp:inline distT="0" distB="0" distL="0" distR="0" wp14:anchorId="3B193673" wp14:editId="299EFA7F">
+            <wp:extent cx="5029200" cy="3680460"/>
+            <wp:effectExtent l="0" t="0" r="0" b="0"/>
+            <wp:docPr id="1656469755" name="Picture 5"/>
+            <wp:cNvGraphicFramePr>
+              <a:graphicFrameLocks xmlns:a="http://schemas.openxmlformats.org/drawingml/2006/main" noChangeAspect="1"/>
+            </wp:cNvGraphicFramePr>
+            <a:graphic xmlns:a="http://schemas.openxmlformats.org/drawingml/2006/main">
+              <a:graphicData uri="http://schemas.openxmlformats.org/drawingml/2006/picture">
+                <pic:pic xmlns:pic="http://schemas.openxmlformats.org/drawingml/2006/picture">
+                  <pic:nvPicPr>
+                    <pic:cNvPr id="0" name="Picture 5"/>
+                    <pic:cNvPicPr>
+                      <a:picLocks noChangeAspect="1" noChangeArrowheads="1"/>
+                    </pic:cNvPicPr>
+                  </pic:nvPicPr>
+                  <pic:blipFill>
+                    <a:blip r:embed="rId10">
+                      <a:extLst>
+                        <a:ext uri="{28A0092B-C50C-407E-A947-70E740481C1C}">
+                          <a14:useLocalDpi xmlns:a14="http://schemas.microsoft.com/office/drawing/2010/main" val="0"/>
+                        </a:ext>
+                      </a:extLst>
+                    </a:blip>
+                    <a:srcRect/>
+                    <a:stretch>
+                      <a:fillRect/>
+                    </a:stretch>
+                  </pic:blipFill>
+                  <pic:spPr bwMode="auto">
+                    <a:xfrm>
+                      <a:off x="0" y="0"/>
+                      <a:ext cx="5029200" cy="3680460"/>
+                    </a:xfrm>
+                    <a:prstGeom prst="rect">
+                      <a:avLst/>
+                    </a:prstGeom>
+                    <a:noFill/>
+                    <a:ln>
+                      <a:noFill/>
+                    </a:ln>
+                  </pic:spPr>
+                </pic:pic>
+              </a:graphicData>
+            </a:graphic>
+          </wp:inline>
+        </w:drawing>
+      </w:r>
+    </w:p>
+    <w:p>
+      <w:pPr>
+        <w:spacing w:after="80" w:line="360" w:lineRule="auto"/>
+        <w:jc w:val="both"/>
+        <w:rPr>
+          <w:rFonts w:ascii="Times New Roman" w:hAnsi="Times New Roman" w:cs="Times New Roman"/>
+          <w:noProof/>
+          <w:sz w:val="28"/>
+          <w:szCs w:val="28"/>
+          <w:lang w:val="sv-SE"/>
+        </w:rPr>
+      </w:pPr>
+      <w:r>
+        <w:rPr>
+          <w:rFonts w:ascii="Times New Roman" w:hAnsi="Times New Roman" w:cs="Times New Roman"/>
+          <w:noProof/>
+          <w:sz w:val="28"/>
+          <w:szCs w:val="28"/>
+          <w:lang w:val="sv-SE"/>
+        </w:rPr>
+        <w:drawing>
+          <wp:inline distT="0" distB="0" distL="0" distR="0" wp14:anchorId="3C3F4EBF" wp14:editId="08531FB7">
+            <wp:extent cx="5029200" cy="3048000"/>
+            <wp:effectExtent l="0" t="0" r="0" b="0"/>
+            <wp:docPr id="100987489" name="Picture 6"/>
+            <wp:cNvGraphicFramePr>
+              <a:graphicFrameLocks xmlns:a="http://schemas.openxmlformats.org/drawingml/2006/main" noChangeAspect="1"/>
+            </wp:cNvGraphicFramePr>
+            <a:graphic xmlns:a="http://schemas.openxmlformats.org/drawingml/2006/main">
+              <a:graphicData uri="http://schemas.openxmlformats.org/drawingml/2006/picture">
+                <pic:pic xmlns:pic="http://schemas.openxmlformats.org/drawingml/2006/picture">
+                  <pic:nvPicPr>
+                    <pic:cNvPr id="0" name="Picture 6"/>
+                    <pic:cNvPicPr>
+                      <a:picLocks noChangeAspect="1" noChangeArrowheads="1"/>
+                    </pic:cNvPicPr>
+                  </pic:nvPicPr>
+                  <pic:blipFill>
+                    <a:blip r:embed="rId11">
+                      <a:extLst>
+                        <a:ext uri="{28A0092B-C50C-407E-A947-70E740481C1C}">
+                          <a14:useLocalDpi xmlns:a14="http://schemas.microsoft.com/office/drawing/2010/main" val="0"/>
+                        </a:ext>
+                      </a:extLst>
+                    </a:blip>
+                    <a:srcRect/>
+                    <a:stretch>
+                      <a:fillRect/>
+                    </a:stretch>
+                  </pic:blipFill>
+                  <pic:spPr bwMode="auto">
+                    <a:xfrm>
+                      <a:off x="0" y="0"/>
+                      <a:ext cx="5029200" cy="3048000"/>
+                    </a:xfrm>
+                    <a:prstGeom prst="rect">
+                      <a:avLst/>
+                    </a:prstGeom>
+                    <a:noFill/>
+                    <a:ln>
+                      <a:noFill/>
+                    </a:ln>
+                  </pic:spPr>
+                </pic:pic>
+              </a:graphicData>
+            </a:graphic>
+          </wp:inline>
+        </w:drawing>
+      </w:r>
     </w:p>
     <w:sectPr>
       <w:pgSz w:w="11906" w:h="16838" w:code="9"/>
@@ -3212,7 +3622,6 @@
   <w:style w:type="character" w:default="1" w:styleId="DefaultParagraphFont">
     <w:name w:val="Default Paragraph Font"/>
     <w:uiPriority w:val="1"/>
-    <w:semiHidden/>
     <w:unhideWhenUsed/>
   </w:style>
   <w:style w:type="table" w:default="1" w:styleId="TableNormal">

</xml_diff>